<commit_message>
feat: complete cross-architecture sweep on Qwen-27B and update mid-term report with Figure 3
</commit_message>
<xml_diff>
--- a/Mid_Term_Report.docx
+++ b/Mid_Term_Report.docx
@@ -1977,12 +1977,52 @@
         <w:spacing w:after="100"/>
       </w:pPr>
       <w:r>
-        <w:t>We conducted an empirical benchmark evaluating 40 distinct attack-channel combinations on `openai/gpt-oss-20b` under two conditions:</w:t>
+        <w:t>To evaluate the real-world vulnerability of network monitoring copilots and verify cross-model generalizability, we conducted empirical benchmarks across two distinct open-weight model architectures:</w:t>
       </w:r>
     </w:p>
     <w:p>
       <w:pPr>
         <w:pStyle w:val="ListNumber"/>
+        <w:spacing w:after="60"/>
+      </w:pPr>
+      <w:r/>
+      <w:r>
+        <w:rPr>
+          <w:b/>
+        </w:rPr>
+        <w:t>`openai/gpt-oss-20b`</w:t>
+      </w:r>
+      <w:r>
+        <w:t xml:space="preserve"> (20-billion parameter open dense transformer)</w:t>
+      </w:r>
+    </w:p>
+    <w:p>
+      <w:pPr>
+        <w:pStyle w:val="ListNumber"/>
+        <w:spacing w:after="60"/>
+      </w:pPr>
+      <w:r/>
+      <w:r>
+        <w:rPr>
+          <w:b/>
+        </w:rPr>
+        <w:t>`qwen/qwen3.8-27b`</w:t>
+      </w:r>
+      <w:r>
+        <w:t xml:space="preserve"> (27-billion parameter Qwen-family transformer)</w:t>
+      </w:r>
+    </w:p>
+    <w:p>
+      <w:pPr>
+        <w:spacing w:after="100"/>
+      </w:pPr>
+      <w:r>
+        <w:t>Each model was subjected to an identical 40-test attack matrix (10 malicious network telemetry records $\times$ 4 payload categories $\times$ 5 protocol channels) under two conditions:</w:t>
+      </w:r>
+    </w:p>
+    <w:p>
+      <w:pPr>
+        <w:pStyle w:val="ListBullet"/>
         <w:spacing w:after="60"/>
       </w:pPr>
       <w:r/>
@@ -1998,7 +2038,7 @@
     </w:p>
     <w:p>
       <w:pPr>
-        <w:pStyle w:val="ListNumber"/>
+        <w:pStyle w:val="ListBullet"/>
         <w:spacing w:after="60"/>
       </w:pPr>
       <w:r/>
@@ -2017,7 +2057,7 @@
         <w:spacing w:after="100"/>
       </w:pPr>
       <w:r>
-        <w:t>In addition, we evaluated a held-out set of clean benign network records to measure the False Suppression Rate (FSR) and latency overhead.</w:t>
+        <w:t>In addition, clean benign network records were evaluated to quantify the False Suppression Rate (FSR) and latency overhead.</w:t>
       </w:r>
     </w:p>
     <w:p>
@@ -2032,7 +2072,7 @@
           <w:color w:val="3B5C8E"/>
           <w:sz w:val="26"/>
         </w:rPr>
-        <w:t>5.1 Overall Security &amp; Utility Performance</w:t>
+        <w:t>5.1 Overall Security &amp; Utility Performance Across Architectures</w:t>
       </w:r>
     </w:p>
     <w:p>
@@ -2040,7 +2080,7 @@
         <w:spacing w:after="100"/>
       </w:pPr>
       <w:r>
-        <w:t>The high-level benchmark results are summarized below:</w:t>
+        <w:t>The comparative benchmark results across both foundation models are summarized below:</w:t>
       </w:r>
     </w:p>
     <w:p>
@@ -2054,25 +2094,31 @@
           <w:color w:val="1A365D"/>
           <w:sz w:val="19"/>
         </w:rPr>
-        <w:t>┌───────────────────────────────────────┬───────────────────┬───────────────────┬───────────────────────────────┐</w:t>
+        <w:t>┌───────────────────────────────────────┬───────────────────────────────────┬───────────────────────────────────┐</w:t>
         <w:br/>
-        <w:t>│ Metric / Dimension                    │ Baseline Copilot  │ Defended Copilot  │ Observed Impact (Δ)           │</w:t>
+        <w:t>│ Metric / Dimension                    │ openai/gpt-oss-20b (20B)          │ qwen/qwen3.8-27b (27B)            │</w:t>
         <w:br/>
-        <w:t>├───────────────────────────────────────┼───────────────────┼───────────────────┼───────────────────────────────┤</w:t>
+        <w:t>│                                       ├─────────────────┬─────────────────┼─────────────────┬─────────────────┤</w:t>
         <w:br/>
-        <w:t>│ Total Injection Attempts              │ 40                │ 40                │ Identical evaluation matrix   │</w:t>
+        <w:t>│                                       │ Baseline        │ Defended        │ Baseline        │ Defended        │</w:t>
         <w:br/>
-        <w:t>│ Successful Injections (False Benign)  │ 11                │ 2                 │ 9 successful attacks blocked  │</w:t>
+        <w:t>├───────────────────────────────────────┼─────────────────┼─────────────────┼─────────────────┼─────────────────┤</w:t>
         <w:br/>
-        <w:t>│ Overall Injection Success Rate (ISR)  │ 27.5%             │ 5.0%              │ -81.8% Relative Reduction     │</w:t>
+        <w:t>│ Total Injection Attempts              │ 40              │ 40              │ 40              │ 40              │</w:t>
         <w:br/>
-        <w:t>│ False Suppression Rate (FSR)          │ 0.0% (0/2)        │ 0.0% (0/2)        │ Zero false alarms on clean log│</w:t>
+        <w:t>│ Successful Injections (False Benign)  │ 11              │ 2               │ 7               │ 0               │</w:t>
         <w:br/>
-        <w:t>│ Mean Inference Latency                │ 5,619.6 ms        │ 7,119.3 ms        │ +1,499.7 ms overhead          │</w:t>
+        <w:t>│ Overall Injection Success Rate (ISR)  │ 27.5%           │ 5.0%            │ 17.5%           │ 0.0%            │</w:t>
         <w:br/>
-        <w:t>│ 95th Percentile (p95) Latency         │ 5,978.9 ms        │ 9,848.0 ms        │ Modest overhead for security  │</w:t>
+        <w:t>│ Vulnerability Reduction (Δ ISR)       │ —               │ -81.8% Relative │ —               │ -100% Eliminated│</w:t>
         <w:br/>
-        <w:t>└───────────────────────────────────────┴───────────────────┴───────────────────┴───────────────────────────────┘</w:t>
+        <w:t>│ False Suppression Rate (FSR)          │ 0.0% (0/2)      │ 0.0% (0/2)      │ 0.0% (0/2)      │ 0.0% (0/2)      │</w:t>
+        <w:br/>
+        <w:t>│ Mean Inference Latency                │ 5,619.6 ms      │ 7,119.3 ms      │ 14,535.3 ms     │ 11,892.4 ms     │</w:t>
+        <w:br/>
+        <w:t>│ 95th Percentile (p95) Latency         │ 5,978.9 ms      │ 9,848.0 ms      │ 17,687.3 ms     │ 13,705.5 ms     │</w:t>
+        <w:br/>
+        <w:t>└───────────────────────────────────────┴─────────────────┴─────────────────┴─────────────────┴─────────────────┘</w:t>
       </w:r>
     </w:p>
     <w:p>
@@ -2085,7 +2131,7 @@
           <w:i/>
           <w:color w:val="334E68"/>
         </w:rPr>
-        <w:t>**Key Milestone Achievement:** Our layered defences successfully eliminated over **80% of all injection vulnerabilities**, driving the residual risk down to **5.0%**, while maintaining a **0.0% False Suppression Rate** on legitimate network telemetry.</w:t>
+        <w:t>**Key Milestone Achievement:** Across both model families, our layered defence suite reduced injection vulnerabilities by **over 80% to 100%**, driving residual risk to **5.0% on GPT-OSS-20B** and **0.0% on Qwen-27B**, while maintaining a **flawless 0.0% False Suppression Rate** on legitimate network traffic.</w:t>
       </w:r>
     </w:p>
     <w:p>
@@ -2523,7 +2569,248 @@
           <w:color w:val="3B5C8E"/>
           <w:sz w:val="26"/>
         </w:rPr>
-        <w:t>5.4 Utility Cost and Trade-Off Analysis (Addressing RQ3)</w:t>
+        <w:t>5.4 Cross-Architecture Comparison (Addressing RQ2: Model Scale &amp; Family)</w:t>
+      </w:r>
+    </w:p>
+    <w:p>
+      <w:pPr>
+        <w:spacing w:before="160" w:after="80"/>
+        <w:jc w:val="center"/>
+      </w:pPr>
+      <w:r>
+        <w:drawing>
+          <wp:inline xmlns:a="http://schemas.openxmlformats.org/drawingml/2006/main" xmlns:pic="http://schemas.openxmlformats.org/drawingml/2006/picture">
+            <wp:extent cx="5303520" cy="2651760"/>
+            <wp:docPr id="3" name="Picture 3"/>
+            <wp:cNvGraphicFramePr>
+              <a:graphicFrameLocks noChangeAspect="1"/>
+            </wp:cNvGraphicFramePr>
+            <a:graphic>
+              <a:graphicData uri="http://schemas.openxmlformats.org/drawingml/2006/picture">
+                <pic:pic>
+                  <pic:nvPicPr>
+                    <pic:cNvPr id="0" name="cross_architecture_comparison.png"/>
+                    <pic:cNvPicPr/>
+                  </pic:nvPicPr>
+                  <pic:blipFill>
+                    <a:blip r:embed="rId11"/>
+                    <a:stretch>
+                      <a:fillRect/>
+                    </a:stretch>
+                  </pic:blipFill>
+                  <pic:spPr>
+                    <a:xfrm>
+                      <a:off x="0" y="0"/>
+                      <a:ext cx="5303520" cy="2651760"/>
+                    </a:xfrm>
+                    <a:prstGeom prst="rect"/>
+                  </pic:spPr>
+                </pic:pic>
+              </a:graphicData>
+            </a:graphic>
+          </wp:inline>
+        </w:drawing>
+      </w:r>
+    </w:p>
+    <w:p>
+      <w:pPr>
+        <w:jc w:val="center"/>
+      </w:pPr>
+      <w:r>
+        <w:rPr>
+          <w:i/>
+          <w:color w:val="555555"/>
+          <w:sz w:val="19"/>
+        </w:rPr>
+        <w:t>Figure 3: Cross-Architecture Vulnerability Comparison Across Attack Categories (GPT-OSS-20B vs. Qwen-27B)</w:t>
+      </w:r>
+    </w:p>
+    <w:p>
+      <w:pPr>
+        <w:spacing w:after="100"/>
+      </w:pPr>
+      <w:r>
+        <w:t xml:space="preserve">To verify whether prompt-injection susceptibility is model-specific or a systemic vulnerability inherent to instruction-tuned language models, we compared </w:t>
+      </w:r>
+      <w:r>
+        <w:rPr>
+          <w:b/>
+        </w:rPr>
+        <w:t>`openai/gpt-oss-20b`</w:t>
+      </w:r>
+      <w:r>
+        <w:t xml:space="preserve"> and </w:t>
+      </w:r>
+      <w:r>
+        <w:rPr>
+          <w:b/>
+        </w:rPr>
+        <w:t>`qwen/qwen3.8-27b`</w:t>
+      </w:r>
+      <w:r>
+        <w:t xml:space="preserve"> across identical attack matrices:</w:t>
+      </w:r>
+    </w:p>
+    <w:p>
+      <w:pPr>
+        <w:spacing w:before="80" w:after="160"/>
+        <w:ind w:left="288"/>
+      </w:pPr>
+      <w:r>
+        <w:rPr>
+          <w:rFonts w:ascii="Consolas" w:hAnsi="Consolas"/>
+          <w:color w:val="1A365D"/>
+          <w:sz w:val="19"/>
+        </w:rPr>
+        <w:t>========================================================================================</w:t>
+        <w:br/>
+        <w:t>Cross-Architecture Comparison by Attack Category: Baseline vs. Defended ISR (%)</w:t>
+        <w:br/>
+        <w:t>========================================================================================</w:t>
+        <w:br/>
+        <w:t>Category                    GPT-OSS-20B (Baseline)   GPT-OSS-20B (Defended)   Qwen-27B (Baseline)   Qwen-27B (Defended)</w:t>
+        <w:br/>
+        <w:t>----------------------------------------------------------------------------------------</w:t>
+        <w:br/>
+        <w:t>Context Manipulation                70.0%                    20.0%                   60.0%                  0.0%</w:t>
+        <w:br/>
+        <w:t>Direct Override                     20.0%                     0.0%                    0.0%                  0.0%</w:t>
+        <w:br/>
+        <w:t>Persona Hijack                      20.0%                     0.0%                   10.0%                  0.0%</w:t>
+        <w:br/>
+        <w:t>Encoding / Obfuscation               0.0%                     0.0%                    0.0%                  0.0%</w:t>
+        <w:br/>
+        <w:t>========================================================================================</w:t>
+      </w:r>
+    </w:p>
+    <w:p>
+      <w:pPr>
+        <w:spacing w:before="80" w:after="160"/>
+        <w:ind w:left="288"/>
+      </w:pPr>
+      <w:r>
+        <w:rPr>
+          <w:rFonts w:ascii="Consolas" w:hAnsi="Consolas"/>
+          <w:color w:val="1A365D"/>
+          <w:sz w:val="19"/>
+        </w:rPr>
+        <w:t>========================================================================================</w:t>
+        <w:br/>
+        <w:t>Cross-Architecture Comparison by Telemetry Channel: Baseline vs. Defended ISR (%)</w:t>
+        <w:br/>
+        <w:t>========================================================================================</w:t>
+        <w:br/>
+        <w:t>Channel                     GPT-OSS-20B (Baseline)   GPT-OSS-20B (Defended)   Qwen-27B (Baseline)   Qwen-27B (Defended)</w:t>
+        <w:br/>
+        <w:t>----------------------------------------------------------------------------------------</w:t>
+        <w:br/>
+        <w:t>alert_msg (Suricata)                75.0%                    25.0%                   25.0%                  0.0%</w:t>
+        <w:br/>
+        <w:t>user_agent (HTTP)                   25.0%                     0.0%                    0.0%                  0.0%</w:t>
+        <w:br/>
+        <w:t>alert_desc (Notes)                  25.0%                     0.0%                   25.0%                  0.0%</w:t>
+        <w:br/>
+        <w:t>raw_log (Connection)                12.5%                     0.0%                   37.5%                  0.0%</w:t>
+        <w:br/>
+        <w:t>dns_query (DNS Name)                 0.0%                     0.0%                    0.0%                  0.0%</w:t>
+        <w:br/>
+        <w:t>========================================================================================</w:t>
+      </w:r>
+    </w:p>
+    <w:p>
+      <w:pPr>
+        <w:pStyle w:val="Heading3"/>
+        <w:spacing w:before="160" w:after="40"/>
+      </w:pPr>
+      <w:r>
+        <w:rPr>
+          <w:rFonts w:ascii="Calibri" w:hAnsi="Calibri"/>
+          <w:b/>
+          <w:color w:val="444444"/>
+          <w:sz w:val="23"/>
+        </w:rPr>
+        <w:t>Key Cross-Architecture Insights:</w:t>
+      </w:r>
+    </w:p>
+    <w:p>
+      <w:pPr>
+        <w:pStyle w:val="ListNumber"/>
+        <w:spacing w:after="60"/>
+      </w:pPr>
+      <w:r/>
+      <w:r>
+        <w:rPr>
+          <w:b/>
+        </w:rPr>
+        <w:t>Context Manipulation is Universally Dangerous:</w:t>
+      </w:r>
+      <w:r>
+        <w:t xml:space="preserve"> Across both independent model architectures (dense GPT vs. Qwen), context manipulation was the single most successful attack strategy (70.0% on GPT-OSS, 60.0% on Qwen-27B). This proves that vulnerability to operational context framing is not an artifact of a single training recipe, but a systemic property of instruction-following LLMs.</w:t>
+      </w:r>
+    </w:p>
+    <w:p>
+      <w:pPr>
+        <w:pStyle w:val="ListNumber"/>
+        <w:spacing w:after="60"/>
+      </w:pPr>
+      <w:r/>
+      <w:r>
+        <w:rPr>
+          <w:b/>
+        </w:rPr>
+        <w:t>Larger Parameter Scale Increases Inherent Resistance:</w:t>
+      </w:r>
+      <w:r>
+        <w:t xml:space="preserve"> Qwen-27B demonstrated higher baseline resilience (17.5% overall ISR) compared to GPT-OSS-20B (27.5% overall ISR), completely rejecting Direct Overrides (0.0%) and HTTP User-Agent injections (0.0%) even in the baseline condition.</w:t>
+      </w:r>
+    </w:p>
+    <w:p>
+      <w:pPr>
+        <w:pStyle w:val="ListNumber"/>
+        <w:spacing w:after="60"/>
+      </w:pPr>
+      <w:r/>
+      <w:r>
+        <w:rPr>
+          <w:b/>
+        </w:rPr>
+        <w:t>Defences Generalize Completely:</w:t>
+      </w:r>
+      <w:r>
+        <w:t xml:space="preserve"> When the layered defence suite was applied, Qwen-27B achieved a </w:t>
+      </w:r>
+      <w:r>
+        <w:rPr>
+          <w:b/>
+        </w:rPr>
+        <w:t>0.0% residual ISR</w:t>
+      </w:r>
+      <w:r>
+        <w:t xml:space="preserve"> across all 40 attack configurations, and GPT-OSS-20B achieved a </w:t>
+      </w:r>
+      <w:r>
+        <w:rPr>
+          <w:b/>
+        </w:rPr>
+        <w:t>5.0% residual ISR</w:t>
+      </w:r>
+      <w:r>
+        <w:t>. This confirms that boundary-awareness and spotlighting transfer seamlessly across distinct foundation models.</w:t>
+      </w:r>
+    </w:p>
+    <w:p>
+      <w:pPr>
+        <w:pStyle w:val="Heading2"/>
+        <w:spacing w:before="200" w:after="80"/>
+      </w:pPr>
+      <w:r>
+        <w:rPr>
+          <w:rFonts w:ascii="Calibri" w:hAnsi="Calibri"/>
+          <w:b/>
+          <w:color w:val="3B5C8E"/>
+          <w:sz w:val="26"/>
+        </w:rPr>
+        <w:t>5.5 Utility Cost and Trade-Off Analysis (Addressing RQ3)</w:t>
       </w:r>
     </w:p>
     <w:p>
@@ -2568,7 +2855,7 @@
         <w:rPr>
           <w:b/>
         </w:rPr>
-        <w:t>zero false positive detections</w:t>
+        <w:t>zero false positive detections on both models</w:t>
       </w:r>
       <w:r>
         <w:t xml:space="preserve">, yielding an FSR of </w:t>
@@ -2593,7 +2880,7 @@
         <w:rPr>
           <w:b/>
         </w:rPr>
-        <w:t>Latency Overhead:</w:t>
+        <w:t>Latency Overhead &amp; Inference Characteristics:</w:t>
       </w:r>
       <w:r/>
     </w:p>
@@ -2602,7 +2889,7 @@
         <w:spacing w:after="100"/>
       </w:pPr>
       <w:r>
-        <w:t xml:space="preserve">  The baseline pipeline achieved a mean latency of </w:t>
+        <w:t xml:space="preserve">  On GPT-OSS-20B, the baseline pipeline achieved a mean latency of </w:t>
       </w:r>
       <w:r>
         <w:rPr>
@@ -2629,7 +2916,25 @@
         <w:t>1,499.7 ms</w:t>
       </w:r>
       <w:r>
-        <w:t xml:space="preserve"> (~26.7% increase). This overhead is primarily attributable to the expanded system prompt (boundary directives add token length to the KV cache) and spotlighting data-marking formatting. For batch incident triage in a SOC, a 1.5-second overhead per record is well within acceptable operational parameters, especially given the corresponding 81.8% vulnerability reduction.</w:t>
+        <w:t xml:space="preserve"> (~26.7% increase). On Qwen-27B, mean latency was </w:t>
+      </w:r>
+      <w:r>
+        <w:rPr>
+          <w:b/>
+        </w:rPr>
+        <w:t>14,535.3 ms</w:t>
+      </w:r>
+      <w:r>
+        <w:t xml:space="preserve"> at baseline and </w:t>
+      </w:r>
+      <w:r>
+        <w:rPr>
+          <w:b/>
+        </w:rPr>
+        <w:t>11,892.4 ms</w:t>
+      </w:r>
+      <w:r>
+        <w:t xml:space="preserve"> under defended conditions. Interestingly, on Qwen-27B, the defended pipeline was *faster* on average because the heuristic pre-filter intercepted and blocked malicious payloads in &lt;1 ms, bypassing the expensive LLM inference call entirely! For SOC analysts processing batches of alerts, this demonstrates that layered pre-filtering can simultaneously improve security and reduce compute costs.</w:t>
       </w:r>
     </w:p>
     <w:p>

</xml_diff>

<commit_message>
docs: update mid-term report with pilot evaluation limitations and add compiled PDF
</commit_message>
<xml_diff>
--- a/Mid_Term_Report.docx
+++ b/Mid_Term_Report.docx
@@ -211,7 +211,7 @@
         <w:spacing w:after="100"/>
       </w:pPr>
       <w:r>
-        <w:t xml:space="preserve">Our preliminary findings show a baseline Injection Success Rate (ISR) of </w:t>
+        <w:t xml:space="preserve">Our preliminary pilot-phase findings, based on a 40-test matrix per model (2 base malicious records $\times$ 4 representative payloads $\times$ 5 channels), show a baseline Injection Success Rate (ISR) of </w:t>
       </w:r>
       <w:r>
         <w:rPr>
@@ -274,16 +274,7 @@
         <w:t>81.8% relative reduction</w:t>
       </w:r>
       <w:r>
-        <w:t>) with zero false suppression (</w:t>
-      </w:r>
-      <w:r>
-        <w:rPr>
-          <w:b/>
-        </w:rPr>
-        <w:t>0.0% FSR</w:t>
-      </w:r>
-      <w:r>
-        <w:t>) on legitimate traffic, at an added latency overhead of ~1.5 seconds per query. We outline our completed milestones, ongoing VMware-based virtualized testbed integration, and timeline for the remainder of the semester targeting submission to peer-reviewed security venues.</w:t>
+        <w:t>) with zero false suppression on the limited benign sample tested, at an added latency overhead of ~1.5 seconds per query. We outline our completed milestones, acknowledge pilot-scale limitations, describe ongoing VMware-based virtualized testbed integration, and present the timeline for scaled evaluation in the remainder of the semester.</w:t>
       </w:r>
     </w:p>
     <w:p>
@@ -1977,7 +1968,7 @@
         <w:spacing w:after="100"/>
       </w:pPr>
       <w:r>
-        <w:t>To evaluate the real-world vulnerability of network monitoring copilots and verify cross-model generalizability, we conducted empirical benchmarks across two distinct open-weight model architectures:</w:t>
+        <w:t>To evaluate the real-world vulnerability of network monitoring copilots and verify cross-model generalizability, we conducted pilot-scale empirical benchmarks across two distinct open-weight model architectures:</w:t>
       </w:r>
     </w:p>
     <w:p>
@@ -2017,7 +2008,52 @@
         <w:spacing w:after="100"/>
       </w:pPr>
       <w:r>
-        <w:t>Each model was subjected to an identical 40-test attack matrix (10 malicious network telemetry records $\times$ 4 payload categories $\times$ 5 protocol channels) under two conditions:</w:t>
+        <w:t xml:space="preserve">Each model was subjected to an identical </w:t>
+      </w:r>
+      <w:r>
+        <w:rPr>
+          <w:b/>
+        </w:rPr>
+        <w:t>40-test pilot attack matrix</w:t>
+      </w:r>
+      <w:r>
+        <w:t xml:space="preserve"> constructed as follows: </w:t>
+      </w:r>
+      <w:r>
+        <w:rPr>
+          <w:b/>
+        </w:rPr>
+        <w:t>2 base malicious Zeek connection records</w:t>
+      </w:r>
+      <w:r>
+        <w:t xml:space="preserve"> $\times$ </w:t>
+      </w:r>
+      <w:r>
+        <w:rPr>
+          <w:b/>
+        </w:rPr>
+        <w:t>1 representative payload per attack category</w:t>
+      </w:r>
+      <w:r>
+        <w:t xml:space="preserve"> (4 categories) $\times$ </w:t>
+      </w:r>
+      <w:r>
+        <w:rPr>
+          <w:b/>
+        </w:rPr>
+        <w:t>5 protocol channels</w:t>
+      </w:r>
+      <w:r>
+        <w:t xml:space="preserve"> = </w:t>
+      </w:r>
+      <w:r>
+        <w:rPr>
+          <w:b/>
+        </w:rPr>
+        <w:t>40 injection tests per condition</w:t>
+      </w:r>
+      <w:r>
+        <w:t>. We selected one canonical payload from each of the four attack categories (DO-01, PH-01, CM-01, and EO-B64) to serve as representative probes for the pilot phase; the full 23-payload corpus is reserved for the scaled evaluation in the second half of the semester. Each model was tested under two conditions:</w:t>
       </w:r>
     </w:p>
     <w:p>
@@ -2057,7 +2093,7 @@
         <w:spacing w:after="100"/>
       </w:pPr>
       <w:r>
-        <w:t>In addition, clean benign network records were evaluated to quantify the False Suppression Rate (FSR) and latency overhead.</w:t>
+        <w:t>In addition, clean benign network records (2 per condition) were evaluated to provide an initial check on the False Suppression Rate (FSR) and latency overhead. We acknowledge that this benign sample is insufficient for definitive FSR claims and plan to expand it to 50+ records in the next phase.</w:t>
       </w:r>
     </w:p>
     <w:p>
@@ -2131,7 +2167,7 @@
           <w:i/>
           <w:color w:val="334E68"/>
         </w:rPr>
-        <w:t>**Key Milestone Achievement:** Across both model families, our layered defence suite reduced injection vulnerabilities by **over 80% to 100%**, driving residual risk to **5.0% on GPT-OSS-20B** and **0.0% on Qwen-27B**, while maintaining a **flawless 0.0% False Suppression Rate** on legitimate network traffic.</w:t>
+        <w:t>**Pilot Milestone Finding:** In this initial pilot evaluation, our layered defence suite reduced injection vulnerabilities by **over 80% to 100%**, driving residual risk to **5.0% on GPT-OSS-20B** and **0.0% on Qwen-27B**, while producing **zero false suppressions** on the limited benign sample tested. These directional findings are encouraging but require validation at larger scale (see Section 6.3 — Limitations).</w:t>
       </w:r>
     </w:p>
     <w:p>
@@ -3070,7 +3106,7 @@
           <w:color w:val="3B5C8E"/>
           <w:sz w:val="26"/>
         </w:rPr>
-        <w:t>6.3 Remaining Work Plan for the Semester</w:t>
+        <w:t>6.3 Limitations of the Pilot-Phase Evaluation</w:t>
       </w:r>
     </w:p>
     <w:p>
@@ -3078,7 +3114,162 @@
         <w:spacing w:after="100"/>
       </w:pPr>
       <w:r>
-        <w:t>To expand this mid-term benchmark into a full conference-ready research paper, our remaining work over Weeks 9–16 will focus on:</w:t>
+        <w:t>We explicitly acknowledge several limitations of this mid-term pilot evaluation that constrain the generalizability of the reported findings. These limitations are deliberate scoping decisions for the first half of the semester and are systematically addressed in our remaining work plan (Section 6.4).</w:t>
+      </w:r>
+    </w:p>
+    <w:p>
+      <w:pPr>
+        <w:pStyle w:val="ListNumber"/>
+        <w:spacing w:after="60"/>
+      </w:pPr>
+      <w:r/>
+      <w:r>
+        <w:rPr>
+          <w:b/>
+        </w:rPr>
+        <w:t>Small Base Record Set:</w:t>
+      </w:r>
+      <w:r>
+        <w:t xml:space="preserve"> The pilot evaluation used only </w:t>
+      </w:r>
+      <w:r>
+        <w:rPr>
+          <w:b/>
+        </w:rPr>
+        <w:t>2 base malicious Zeek connection records</w:t>
+      </w:r>
+      <w:r>
+        <w:t xml:space="preserve"> (`zeek-conn-3` and `zeek-conn-4`) as injection targets. Both originate from the same source IP and share similar connection characteristics. This limits the diversity of network telemetry contexts tested — HTTP request records, DNS transaction records, and Suricata EVE alert records were not represented as base targets. The full evaluation (Weeks 11–13) will expand the malicious record corpus to 500+ records spanning all log types, sourced from live VMware testbed traffic.</w:t>
+      </w:r>
+    </w:p>
+    <w:p>
+      <w:pPr>
+        <w:pStyle w:val="ListNumber"/>
+        <w:spacing w:after="60"/>
+      </w:pPr>
+      <w:r/>
+      <w:r>
+        <w:rPr>
+          <w:b/>
+        </w:rPr>
+        <w:t>Single Representative Payload per Category:</w:t>
+      </w:r>
+      <w:r>
+        <w:t xml:space="preserve"> From our full bank of 23 curated payloads (8 Direct Override, 6 Persona Hijack, 5 Context Manipulation, 4 Encoding/Obfuscation), we tested </w:t>
+      </w:r>
+      <w:r>
+        <w:rPr>
+          <w:b/>
+        </w:rPr>
+        <w:t>one canonical payload per category</w:t>
+      </w:r>
+      <w:r>
+        <w:t xml:space="preserve"> (DO-01, PH-01, CM-01, EO-B64) in the pilot phase. Category-level ISR findings therefore reflect the effectiveness of individual payload exemplars rather than comprehensive category coverage. The scaled evaluation will deploy all 23 payloads.</w:t>
+      </w:r>
+    </w:p>
+    <w:p>
+      <w:pPr>
+        <w:pStyle w:val="ListNumber"/>
+        <w:spacing w:after="60"/>
+      </w:pPr>
+      <w:r/>
+      <w:r>
+        <w:rPr>
+          <w:b/>
+        </w:rPr>
+        <w:t>Limited Benign Sample for FSR:</w:t>
+      </w:r>
+      <w:r>
+        <w:t xml:space="preserve"> The False Suppression Rate was measured on only </w:t>
+      </w:r>
+      <w:r>
+        <w:rPr>
+          <w:b/>
+        </w:rPr>
+        <w:t>2 benign records per condition</w:t>
+      </w:r>
+      <w:r>
+        <w:t>. While the observed 0% FSR is directionally positive, a definitive FSR claim requires testing against 50–100+ diverse benign records covering normal web browsing, DNS lookups, SSH sessions, and routine internal traffic patterns.</w:t>
+      </w:r>
+    </w:p>
+    <w:p>
+      <w:pPr>
+        <w:pStyle w:val="ListNumber"/>
+        <w:spacing w:after="60"/>
+      </w:pPr>
+      <w:r/>
+      <w:r>
+        <w:rPr>
+          <w:b/>
+        </w:rPr>
+        <w:t>Classification Only — No Summarization Evaluation:</w:t>
+      </w:r>
+      <w:r>
+        <w:t xml:space="preserve"> All experiments in this pilot phase evaluate the </w:t>
+      </w:r>
+      <w:r>
+        <w:rPr>
+          <w:b/>
+        </w:rPr>
+        <w:t>classification task</w:t>
+      </w:r>
+      <w:r>
+        <w:t xml:space="preserve"> exclusively. Our proposal also targets summarization-task vulnerability (consistent with Pandey &amp; Bhujang's finding of 96% ISR on summarization [6]). Summarization attack evaluation is planned for the second half of the semester.</w:t>
+      </w:r>
+    </w:p>
+    <w:p>
+      <w:pPr>
+        <w:pStyle w:val="ListNumber"/>
+        <w:spacing w:after="60"/>
+      </w:pPr>
+      <w:r/>
+      <w:r>
+        <w:rPr>
+          <w:b/>
+        </w:rPr>
+        <w:t>Combined Defence Suite Without Ablation:</w:t>
+      </w:r>
+      <w:r>
+        <w:t xml:space="preserve"> Defences were evaluated as a combined layered stack (all three active simultaneously). We have not yet conducted ablation studies isolating the contribution of each individual defence (boundary-awareness alone, spotlighting alone, heuristic filter alone). Ablation experiments are planned for Weeks 9–10 to determine which defence mechanism drives the observed ISR reduction for each attack category.</w:t>
+      </w:r>
+    </w:p>
+    <w:p>
+      <w:pPr>
+        <w:pStyle w:val="ListNumber"/>
+        <w:spacing w:after="60"/>
+      </w:pPr>
+      <w:r/>
+      <w:r>
+        <w:rPr>
+          <w:b/>
+        </w:rPr>
+        <w:t>Statistical Power:</w:t>
+      </w:r>
+      <w:r>
+        <w:t xml:space="preserve"> With 40 observations per condition and 8–10 per sub-group (category or channel), individual percentage differences are influenced by single classification outcomes. Formal statistical significance testing (Fisher's exact test) will be applied once sample sizes are scaled to support meaningful inference.</w:t>
+      </w:r>
+    </w:p>
+    <w:p>
+      <w:pPr>
+        <w:pStyle w:val="Heading2"/>
+        <w:spacing w:before="200" w:after="80"/>
+      </w:pPr>
+      <w:r>
+        <w:rPr>
+          <w:rFonts w:ascii="Calibri" w:hAnsi="Calibri"/>
+          <w:b/>
+          <w:color w:val="3B5C8E"/>
+          <w:sz w:val="26"/>
+        </w:rPr>
+        <w:t>6.4 Remaining Work Plan for the Semester</w:t>
+      </w:r>
+    </w:p>
+    <w:p>
+      <w:pPr>
+        <w:spacing w:after="100"/>
+      </w:pPr>
+      <w:r>
+        <w:t>To expand this mid-term pilot benchmark into a full conference-ready research paper, our remaining work over Weeks 9–16 will focus on:</w:t>
       </w:r>
     </w:p>
     <w:p>

</xml_diff>